<commit_message>
Solution document: team details, new repo and video links, current dashboard and assistant details
</commit_message>
<xml_diff>
--- a/docs/FleetPulse_Solution_Document.docx
+++ b/docs/FleetPulse_Solution_Document.docx
@@ -52,7 +52,7 @@
           <w:sz w:val="21"/>
           <w:szCs w:val="21"/>
         </w:rPr>
-        <w:t xml:space="preserve">[Team name]</w:t>
+        <w:t xml:space="preserve">Kshitij Gupta</w:t>
       </w:r>
     </w:p>
     <w:p>
@@ -75,7 +75,7 @@
           <w:sz w:val="21"/>
           <w:szCs w:val="21"/>
         </w:rPr>
-        <w:t xml:space="preserve">[Name - role - email, for each member]</w:t>
+        <w:t xml:space="preserve">Kshitij Gupta (kg0237@srmist.edu.in)</w:t>
       </w:r>
     </w:p>
     <w:p>
@@ -121,7 +121,7 @@
           <w:sz w:val="21"/>
           <w:szCs w:val="21"/>
         </w:rPr>
-        <w:t xml:space="preserve">https://github.com/guptaksh17/motorq</w:t>
+        <w:t xml:space="preserve">https://github.com/guptaksh17/fleetpulse</w:t>
       </w:r>
     </w:p>
     <w:p>
@@ -144,7 +144,7 @@
           <w:sz w:val="21"/>
           <w:szCs w:val="21"/>
         </w:rPr>
-        <w:t xml:space="preserve">[Video link]</w:t>
+        <w:t xml:space="preserve">https://www.youtube.com/watch?v=g7IFX9hf6rQ</w:t>
       </w:r>
     </w:p>
     <w:p>
@@ -167,7 +167,7 @@
           <w:sz w:val="21"/>
           <w:szCs w:val="21"/>
         </w:rPr>
-        <w:t xml:space="preserve">29/09/2026</w:t>
+        <w:t xml:space="preserve">01/10/2026</w:t>
       </w:r>
     </w:p>
     <w:p>
@@ -212,22 +212,6 @@
       </w:sdtContent>
     </w:sdt>
     <w:p>
-      <w:pPr>
-        <w:spacing w:after="100"/>
-      </w:pPr>
-      <w:r>
-        <w:rPr>
-          <w:rFonts w:ascii="Calibri" w:cs="Calibri" w:eastAsia="Calibri" w:hAnsi="Calibri"/>
-          <w:i/>
-          <w:iCs/>
-          <w:color w:val="666666"/>
-          <w:sz w:val="18"/>
-          <w:szCs w:val="18"/>
-        </w:rPr>
-        <w:t xml:space="preserve">(Right-click and choose Update Field in Word to refresh page numbers.)</w:t>
-      </w:r>
-    </w:p>
-    <w:p>
       <w:r>
         <w:br w:type="page"/>
       </w:r>
@@ -357,7 +341,7 @@
           <w:sz w:val="21"/>
           <w:szCs w:val="21"/>
         </w:rPr>
-        <w:t xml:space="preserve">Throughput on one laptop: Kafka broker 65,848 events/s produced, 41,417 events/s consumed by one consumer; stream processor 1,162 events/s per process; API API p95 115.9 ms / p99 195.2 ms at 484.6 requests/s with 0 errors.</w:t>
+        <w:t xml:space="preserve">Throughput on one laptop: Kafka broker 65,848 events/s produced, 41,417 events/s consumed by one consumer; stream processor 1,162 events/s per process; API p95 115.9 ms / p99 195.2 ms at 484.6 requests/s with 0 errors.</w:t>
       </w:r>
     </w:p>
     <w:p>
@@ -2501,7 +2485,7 @@
           <w:sz w:val="21"/>
           <w:szCs w:val="21"/>
         </w:rPr>
-        <w:t xml:space="preserve">Status is Done unless stated. Video timestamps follow the demo script in docs/demo-script.md.</w:t>
+        <w:t xml:space="preserve">Status is Done unless stated. Video timestamps refer to the submitted demo video (script in docs/video/video-script.md).</w:t>
       </w:r>
     </w:p>
     <w:tbl>
@@ -2856,7 +2840,7 @@
                 <w:sz w:val="18"/>
                 <w:szCs w:val="18"/>
               </w:rPr>
-              <w:t xml:space="preserve">03:00</w:t>
+              <w:t xml:space="preserve">01:00</w:t>
             </w:r>
           </w:p>
         </w:tc>
@@ -3019,7 +3003,7 @@
                 <w:sz w:val="18"/>
                 <w:szCs w:val="18"/>
               </w:rPr>
-              <w:t xml:space="preserve">03:20</w:t>
+              <w:t xml:space="preserve">01:00</w:t>
             </w:r>
           </w:p>
         </w:tc>
@@ -3182,7 +3166,7 @@
                 <w:sz w:val="18"/>
                 <w:szCs w:val="18"/>
               </w:rPr>
-              <w:t xml:space="preserve">03:20</w:t>
+              <w:t xml:space="preserve">01:00</w:t>
             </w:r>
           </w:p>
         </w:tc>
@@ -3345,7 +3329,7 @@
                 <w:sz w:val="18"/>
                 <w:szCs w:val="18"/>
               </w:rPr>
-              <w:t xml:space="preserve">03:40</w:t>
+              <w:t xml:space="preserve">02:35</w:t>
             </w:r>
           </w:p>
         </w:tc>
@@ -3508,7 +3492,7 @@
                 <w:sz w:val="18"/>
                 <w:szCs w:val="18"/>
               </w:rPr>
-              <w:t xml:space="preserve">01:50</w:t>
+              <w:t xml:space="preserve">02:35</w:t>
             </w:r>
           </w:p>
         </w:tc>
@@ -3671,7 +3655,7 @@
                 <w:sz w:val="18"/>
                 <w:szCs w:val="18"/>
               </w:rPr>
-              <w:t xml:space="preserve">03:40</w:t>
+              <w:t xml:space="preserve">03:50</w:t>
             </w:r>
           </w:p>
         </w:tc>
@@ -3997,7 +3981,7 @@
                 <w:sz w:val="18"/>
                 <w:szCs w:val="18"/>
               </w:rPr>
-              <w:t xml:space="preserve">02:20</w:t>
+              <w:t xml:space="preserve">03:35</w:t>
             </w:r>
           </w:p>
         </w:tc>
@@ -4160,7 +4144,7 @@
                 <w:sz w:val="18"/>
                 <w:szCs w:val="18"/>
               </w:rPr>
-              <w:t xml:space="preserve">01:10</w:t>
+              <w:t xml:space="preserve">02:00</w:t>
             </w:r>
           </w:p>
         </w:tc>
@@ -4323,7 +4307,7 @@
                 <w:sz w:val="18"/>
                 <w:szCs w:val="18"/>
               </w:rPr>
-              <w:t xml:space="preserve">01:30</w:t>
+              <w:t xml:space="preserve">01:40</w:t>
             </w:r>
           </w:p>
         </w:tc>
@@ -4486,7 +4470,7 @@
                 <w:sz w:val="18"/>
                 <w:szCs w:val="18"/>
               </w:rPr>
-              <w:t xml:space="preserve">02:40</w:t>
+              <w:t xml:space="preserve">03:20</w:t>
             </w:r>
           </w:p>
         </w:tc>
@@ -4626,7 +4610,7 @@
                 <w:sz w:val="18"/>
                 <w:szCs w:val="18"/>
               </w:rPr>
-              <w:t xml:space="preserve">services/api/app/static/index.html</w:t>
+              <w:t xml:space="preserve">frontend/ (Next.js)</w:t>
             </w:r>
           </w:p>
         </w:tc>
@@ -4649,7 +4633,7 @@
                 <w:sz w:val="18"/>
                 <w:szCs w:val="18"/>
               </w:rPr>
-              <w:t xml:space="preserve">01:00</w:t>
+              <w:t xml:space="preserve">01:40</w:t>
             </w:r>
           </w:p>
         </w:tc>
@@ -4812,7 +4796,7 @@
                 <w:sz w:val="18"/>
                 <w:szCs w:val="18"/>
               </w:rPr>
-              <w:t xml:space="preserve">02:50</w:t>
+              <w:t xml:space="preserve">02:55</w:t>
             </w:r>
           </w:p>
         </w:tc>
@@ -4975,7 +4959,7 @@
                 <w:sz w:val="18"/>
                 <w:szCs w:val="18"/>
               </w:rPr>
-              <w:t xml:space="preserve">04:00</w:t>
+              <w:t xml:space="preserve">04:30</w:t>
             </w:r>
           </w:p>
         </w:tc>
@@ -5138,7 +5122,7 @@
                 <w:sz w:val="18"/>
                 <w:szCs w:val="18"/>
               </w:rPr>
-              <w:t xml:space="preserve">02:30</w:t>
+              <w:t xml:space="preserve">02:55</w:t>
             </w:r>
           </w:p>
         </w:tc>
@@ -5301,7 +5285,7 @@
                 <w:sz w:val="18"/>
                 <w:szCs w:val="18"/>
               </w:rPr>
-              <w:t xml:space="preserve">04:00</w:t>
+              <w:t xml:space="preserve">03:50</w:t>
             </w:r>
           </w:p>
         </w:tc>
@@ -5945,7 +5929,7 @@
                 <w:sz w:val="18"/>
                 <w:szCs w:val="18"/>
               </w:rPr>
-              <w:t xml:space="preserve">5 s scoring loop, 5 s dashboard refresh</w:t>
+              <w:t xml:space="preserve">Event-driven scoring on each snapshot; dashboard polls every 2 s</w:t>
             </w:r>
           </w:p>
         </w:tc>
@@ -5968,7 +5952,7 @@
                 <w:sz w:val="18"/>
                 <w:szCs w:val="18"/>
               </w:rPr>
-              <w:t xml:space="preserve">typically &lt; 10 s</w:t>
+              <w:t xml:space="preserve">ingest to risk p50 1.70 s; about 2-4 s to screen</w:t>
             </w:r>
           </w:p>
         </w:tc>
@@ -6341,7 +6325,7 @@
                 <w:sz w:val="18"/>
                 <w:szCs w:val="18"/>
               </w:rPr>
-              <w:t xml:space="preserve">FastAPI, psycopg2 pools; single-page HTML/JS</w:t>
+              <w:t xml:space="preserve">FastAPI, psycopg2 pools; Next.js 16 + React 19 dashboard (shadcn/ui, Recharts)</w:t>
             </w:r>
           </w:p>
         </w:tc>
@@ -6364,7 +6348,7 @@
                 <w:sz w:val="18"/>
                 <w:szCs w:val="18"/>
               </w:rPr>
-              <w:t xml:space="preserve">OpenAPI out of the box, simple sync SQL; no build step for the UI</w:t>
+              <w:t xml:space="preserve">OpenAPI out of the box, simple sync SQL; the dashboard proxies /api/v1 to the API and ships as its own container</w:t>
             </w:r>
           </w:p>
         </w:tc>
@@ -7477,7 +7461,7 @@
           <w:sz w:val="21"/>
           <w:szCs w:val="21"/>
         </w:rPr>
-        <w:t xml:space="preserve">Local: one command, docker compose up, starts Kafka, PostgreSQL, TimescaleDB, Redis, the four pipeline services, the API, the scorer and the simulator.</w:t>
+        <w:t xml:space="preserve">Local: one command, docker compose up, starts Kafka, PostgreSQL, TimescaleDB, Redis, the four pipeline services, the API, the scorer, the Next.js dashboard (port 3000) and the simulator.</w:t>
       </w:r>
     </w:p>
     <w:p>
@@ -8633,7 +8617,7 @@
                 <w:sz w:val="18"/>
                 <w:szCs w:val="18"/>
               </w:rPr>
-              <w:t xml:space="preserve">Summary KPIs cached 5 s per tenant</w:t>
+              <w:t xml:space="preserve">Summary KPIs cached 2 s per tenant</w:t>
             </w:r>
           </w:p>
         </w:tc>
@@ -9387,7 +9371,7 @@
                 <w:sz w:val="18"/>
                 <w:szCs w:val="18"/>
               </w:rPr>
-              <w:t xml:space="preserve">O(S) per event; O(B x S) per snapshot; 358 KB per vehicle</w:t>
+              <w:t xml:space="preserve">O(S) per event; O(B x S) per snapshot; 139 KB per vehicle (packed)</w:t>
             </w:r>
           </w:p>
         </w:tc>
@@ -12834,7 +12818,7 @@
           <w:sz w:val="21"/>
           <w:szCs w:val="21"/>
         </w:rPr>
-        <w:t xml:space="preserve">POST /api/v1/assistant uses Groq's OpenAI-compatible chat API (free tier, llama-3.3-70b-versatile) with tool-calling over fleet_summary, top_priority, active_alerts and vehicle_detail. The system prompt forbids invented numbers and treats tool data as data. Without a key, or on an LLM error, a deterministic keyword router answers from the same tools. Rules-mode latency is about 5 ms; the LLM path is bounded by 4 steps and a 20 s timeout.</w:t>
+        <w:t xml:space="preserve">POST /api/v1/assistant uses Groq's OpenAI-compatible chat API (free tier, openai/gpt-oss-120b) with tool-calling over fleet_summary, top_priority, active_alerts and vehicle_detail. The system prompt forbids invented numbers and treats tool data as data. Without a key, or on an LLM error, a deterministic keyword router answers from the same tools. Rules-mode latency is about 5 ms; the LLM path is bounded by 4 steps and a 20 s timeout.</w:t>
       </w:r>
     </w:p>
     <w:p>
@@ -13664,7 +13648,7 @@
                 <w:sz w:val="18"/>
                 <w:szCs w:val="18"/>
               </w:rPr>
-              <w:t xml:space="preserve">0:00 - 0:30</w:t>
+              <w:t xml:space="preserve">0:00 - 0:20</w:t>
             </w:r>
           </w:p>
         </w:tc>
@@ -13687,7 +13671,7 @@
                 <w:sz w:val="18"/>
                 <w:szCs w:val="18"/>
               </w:rPr>
-              <w:t xml:space="preserve">Problem</w:t>
+              <w:t xml:space="preserve">Introduction</w:t>
             </w:r>
           </w:p>
         </w:tc>
@@ -13710,7 +13694,7 @@
                 <w:sz w:val="18"/>
                 <w:szCs w:val="18"/>
               </w:rPr>
-              <w:t xml:space="preserve">The fleet manager, the cost of a surprise breakdown, and the fact that about 39 percent of components need service within a quarter</w:t>
+              <w:t xml:space="preserve">Title slide: what FleetPulse does in one sentence</w:t>
             </w:r>
           </w:p>
         </w:tc>
@@ -13735,7 +13719,7 @@
                 <w:sz w:val="18"/>
                 <w:szCs w:val="18"/>
               </w:rPr>
-              <w:t xml:space="preserve">0:30 - 1:00</w:t>
+              <w:t xml:space="preserve">0:20 - 1:00</w:t>
             </w:r>
           </w:p>
         </w:tc>
@@ -13758,7 +13742,7 @@
                 <w:sz w:val="18"/>
                 <w:szCs w:val="18"/>
               </w:rPr>
-              <w:t xml:space="preserve">Solution</w:t>
+              <w:t xml:space="preserve">Problem</w:t>
             </w:r>
           </w:p>
         </w:tc>
@@ -13781,7 +13765,7 @@
                 <w:sz w:val="18"/>
                 <w:szCs w:val="18"/>
               </w:rPr>
-              <w:t xml:space="preserve">One line: a 7-day, component-level failure probability, priced and ranked</w:t>
+              <w:t xml:space="preserve">Breakdowns found only when the truck stops; calendar-based service; fixed workshop capacity, so the question is what to fix first</w:t>
             </w:r>
           </w:p>
         </w:tc>
@@ -13806,7 +13790,7 @@
                 <w:sz w:val="18"/>
                 <w:szCs w:val="18"/>
               </w:rPr>
-              <w:t xml:space="preserve">1:00 - 3:00</w:t>
+              <w:t xml:space="preserve">1:00 - 1:30</w:t>
             </w:r>
           </w:p>
         </w:tc>
@@ -13829,7 +13813,7 @@
                 <w:sz w:val="18"/>
                 <w:szCs w:val="18"/>
               </w:rPr>
-              <w:t xml:space="preserve">Live demo</w:t>
+              <w:t xml:space="preserve">Solution</w:t>
             </w:r>
           </w:p>
         </w:tc>
@@ -13852,7 +13836,7 @@
                 <w:sz w:val="18"/>
                 <w:szCs w:val="18"/>
               </w:rPr>
-              <w:t xml:space="preserve">Login; KPIs; priority queue; open a high-risk vehicle; trends and service history; live stream with an injected DTC raising a rule alert within seconds; acknowledge; tenant isolation with the viewer account</w:t>
+              <w:t xml:space="preserve">How it works: 100K vehicles, Kafka, VIN validation and DLQ, OEM adapters, dedup and exact windows, calibrated risk priced in dollars, secure API</w:t>
             </w:r>
           </w:p>
         </w:tc>
@@ -13877,7 +13861,7 @@
                 <w:sz w:val="18"/>
                 <w:szCs w:val="18"/>
               </w:rPr>
-              <w:t xml:space="preserve">3:00 - 4:15</w:t>
+              <w:t xml:space="preserve">1:30 - 3:50</w:t>
             </w:r>
           </w:p>
         </w:tc>
@@ -13900,7 +13884,7 @@
                 <w:sz w:val="18"/>
                 <w:szCs w:val="18"/>
               </w:rPr>
-              <w:t xml:space="preserve">Under the hood</w:t>
+              <w:t xml:space="preserve">Live demo</w:t>
             </w:r>
           </w:p>
         </w:tc>
@@ -13923,7 +13907,7 @@
                 <w:sz w:val="18"/>
                 <w:szCs w:val="18"/>
               </w:rPr>
-              <w:t xml:space="preserve">Architecture; parity result; model report vs baseline; Kafka and API benchmarks; stream-processor restart with no duplicates</w:t>
+              <w:t xml:space="preserve">Live stream started; Pulse KPIs; priority queue ranked by dollars; high-risk vehicle; injected brake DTC raising a rule alert within seconds and acknowledged; fleet assistant; viewer account showing tenant isolation; model performance</w:t>
             </w:r>
           </w:p>
         </w:tc>
@@ -13948,7 +13932,7 @@
                 <w:sz w:val="18"/>
                 <w:szCs w:val="18"/>
               </w:rPr>
-              <w:t xml:space="preserve">4:15 - 5:00</w:t>
+              <w:t xml:space="preserve">3:50 - 4:30</w:t>
             </w:r>
           </w:p>
         </w:tc>
@@ -13971,6 +13955,77 @@
                 <w:sz w:val="18"/>
                 <w:szCs w:val="18"/>
               </w:rPr>
+              <w:t xml:space="preserve">Results</w:t>
+            </w:r>
+          </w:p>
+        </w:tc>
+        <w:tc>
+          <w:tcPr>
+            <w:tcW w:type="dxa" w:w="6747"/>
+            <w:tcMar>
+              <w:top w:type="dxa" w:w="40"/>
+              <w:left w:type="dxa" w:w="80"/>
+              <w:bottom w:type="dxa" w:w="40"/>
+              <w:right w:type="dxa" w:w="80"/>
+            </w:tcMar>
+          </w:tcPr>
+          <w:p>
+            <w:r>
+              <w:rPr>
+                <w:rFonts w:ascii="Calibri" w:cs="Calibri" w:eastAsia="Calibri" w:hAnsi="Calibri"/>
+                <w:b w:val="false"/>
+                <w:bCs w:val="false"/>
+                <w:sz w:val="18"/>
+                <w:szCs w:val="18"/>
+              </w:rPr>
+              <w:t xml:space="preserve">Scale, freshness, API latency, chaos test with zero duplicates, model precision, feature parity, tests and security scans</w:t>
+            </w:r>
+          </w:p>
+        </w:tc>
+      </w:tr>
+      <w:tr>
+        <w:tc>
+          <w:tcPr>
+            <w:tcW w:type="dxa" w:w="1349"/>
+            <w:tcMar>
+              <w:top w:type="dxa" w:w="40"/>
+              <w:left w:type="dxa" w:w="80"/>
+              <w:bottom w:type="dxa" w:w="40"/>
+              <w:right w:type="dxa" w:w="80"/>
+            </w:tcMar>
+          </w:tcPr>
+          <w:p>
+            <w:r>
+              <w:rPr>
+                <w:rFonts w:ascii="Calibri" w:cs="Calibri" w:eastAsia="Calibri" w:hAnsi="Calibri"/>
+                <w:b w:val="false"/>
+                <w:bCs w:val="false"/>
+                <w:sz w:val="18"/>
+                <w:szCs w:val="18"/>
+              </w:rPr>
+              <w:t xml:space="preserve">4:30 - 5:00</w:t>
+            </w:r>
+          </w:p>
+        </w:tc>
+        <w:tc>
+          <w:tcPr>
+            <w:tcW w:type="dxa" w:w="1542"/>
+            <w:tcMar>
+              <w:top w:type="dxa" w:w="40"/>
+              <w:left w:type="dxa" w:w="80"/>
+              <w:bottom w:type="dxa" w:w="40"/>
+              <w:right w:type="dxa" w:w="80"/>
+            </w:tcMar>
+          </w:tcPr>
+          <w:p>
+            <w:r>
+              <w:rPr>
+                <w:rFonts w:ascii="Calibri" w:cs="Calibri" w:eastAsia="Calibri" w:hAnsi="Calibri"/>
+                <w:b w:val="false"/>
+                <w:bCs w:val="false"/>
+                <w:sz w:val="18"/>
+                <w:szCs w:val="18"/>
+              </w:rPr>
               <w:t xml:space="preserve">Impact &amp; next steps</w:t>
             </w:r>
           </w:p>
@@ -13994,7 +14049,7 @@
                 <w:sz w:val="18"/>
                 <w:szCs w:val="18"/>
               </w:rPr>
-              <w:t xml:space="preserve">Measured results, honest gaps, the path to 100K events/s, team</w:t>
+              <w:t xml:space="preserve">Summary, deployment path, next steps to 100K events/s and a pilot on real OEM data</w:t>
             </w:r>
           </w:p>
         </w:tc>
@@ -14020,7 +14075,7 @@
           <w:sz w:val="21"/>
           <w:szCs w:val="21"/>
         </w:rPr>
-        <w:t xml:space="preserve">[Video link]</w:t>
+        <w:t xml:space="preserve">https://www.youtube.com/watch?v=g7IFX9hf6rQ</w:t>
       </w:r>
     </w:p>
     <w:p>
@@ -14033,7 +14088,7 @@
           <w:sz w:val="21"/>
           <w:szCs w:val="21"/>
         </w:rPr>
-        <w:t xml:space="preserve">A step-by-step script with commands is in docs/demo-script.md.</w:t>
+        <w:t xml:space="preserve">The script, slides and setup steps are in docs/video/.</w:t>
       </w:r>
     </w:p>
     <w:p>

</xml_diff>